<commit_message>
Declara que el profesor guía autorizó después de conocer los resultados (I-10)
- Nuevo incidente I-10: la apertura de 2024 se hizo con la aprobación informada por el estudiante y el profesor
  guía la autorizó después de conocer los resultados. No cambia cifras (el protocolo se pre-registró antes de
  abrir), pero la constancia pasa a ser una ratificación posterior.
- Parte A de la constancia reescrita como ratificación, con la fecha de la primera aprobación del profesor.
- Enmienda 01: sus análisis se informan tal cual resulten; ninguno se modifica, se repite ni se descarta porque
  no mejore el modelo (decisión del autor y del profesor, 21-10-2026).
- Documento para firma e informes v5 (guía, Fases 1 y 5) actualizados.

Co-Authored-By: Claude Opus 5.5 <noreply@anthropic.com>
Claude-Session: https://claude.ai/code/session_0192aVCC8aocJbeAsVJ1Mter
</commit_message>
<xml_diff>
--- a/docs/00_guia_del_proyecto/Guia_del_proyecto.docx
+++ b/docs/00_guia_del_proyecto/Guia_del_proyecto.docx
@@ -5640,7 +5640,7 @@
                 <w:sz w:val="19"/>
                 <w:szCs w:val="19"/>
               </w:rPr>
-              <w:t xml:space="preserve">Registro completo de incidentes (I-01 a I-09) y borrador de la enmienda 01 al protocolo</w:t>
+              <w:t xml:space="preserve">Registro completo de incidentes (I-01 a I-10) y borrador de la enmienda 01 al protocolo</w:t>
             </w:r>
           </w:p>
         </w:tc>
@@ -5740,7 +5740,7 @@
         <w:t xml:space="preserve">docs/gobernanza/Etapa0_Gobernanza_para_firma.docx</w:t>
       </w:r>
       <w:r>
-        <w:t xml:space="preserve">); luego registrar la enmienda con </w:t>
+        <w:t xml:space="preserve">). Su Parte A ratifica la apertura de 2024, porque su aprobación llegó después de conocer los resultados (I-10). Luego registrar la enmienda con </w:t>
       </w:r>
       <w:r>
         <w:rPr>

</xml_diff>

<commit_message>
Fase 1 v6: restaura la versión 2 del informe y la corrige según lo ejecutado
- docs/fase1_comprension_dominio/Informe_Fase1_v6.docx: misma estructura y lenguaje
  que la versión 2 (PDF), con las cifras medidas en las Fases 2 a 5, las 17 decisiones
  resueltas y un Anexo A con cada cambio respecto de la versión 2.
- La v5 pasa a docs/historial/fase1/; el PDF de la versión 2 se conserva sin cambios
  (Informe_Fase1_v2_original.pdf).
- VERSIONES_Y_DESVIACIONES.md, docs/README.md, docs/historial/README.md, README.md
  y la guía del proyecto apuntan a la v6.

Co-Authored-By: Claude Opus 5.5 <noreply@anthropic.com>
Claude-Session: https://claude.ai/code/session_0192aVCC8aocJbeAsVJ1Mter
</commit_message>
<xml_diff>
--- a/docs/00_guia_del_proyecto/Guia_del_proyecto.docx
+++ b/docs/00_guia_del_proyecto/Guia_del_proyecto.docx
@@ -181,6 +181,8 @@
             </w:pPr>
             <w:r>
               <w:rPr>
+                <w:b/>
+                <w:bCs/>
                 <w:sz w:val="21"/>
                 <w:szCs w:val="21"/>
               </w:rPr>
@@ -243,6 +245,8 @@
             </w:pPr>
             <w:r>
               <w:rPr>
+                <w:b/>
+                <w:bCs/>
                 <w:sz w:val="21"/>
                 <w:szCs w:val="21"/>
               </w:rPr>
@@ -305,6 +309,8 @@
             </w:pPr>
             <w:r>
               <w:rPr>
+                <w:b/>
+                <w:bCs/>
                 <w:sz w:val="21"/>
                 <w:szCs w:val="21"/>
               </w:rPr>
@@ -367,6 +373,8 @@
             </w:pPr>
             <w:r>
               <w:rPr>
+                <w:b/>
+                <w:bCs/>
                 <w:sz w:val="21"/>
                 <w:szCs w:val="21"/>
               </w:rPr>
@@ -854,7 +862,7 @@
         <w:spacing w:after="120" w:line="276"/>
       </w:pPr>
       <w:r>
-        <w:t xml:space="preserve">El proyecto sigue CRISP-DM. Cada fase tiene su informe v5 en </w:t>
+        <w:t xml:space="preserve">El proyecto sigue CRISP-DM. Cada fase tiene su informe en </w:t>
       </w:r>
       <w:r>
         <w:rPr>
@@ -865,7 +873,7 @@
         <w:t xml:space="preserve">docs/</w:t>
       </w:r>
       <w:r>
-        <w:t xml:space="preserve"> y, desde la Fase 2, su carpeta de código con pruebas automáticas y una tabla de «puertas» de calidad que deben pasar para cerrarla.</w:t>
+        <w:t xml:space="preserve"> (v5; la Fase 1, v6) y, desde la Fase 2, su carpeta de código con pruebas automáticas y una tabla de «puertas» de calidad que deben pasar para cerrarla.</w:t>
       </w:r>
     </w:p>
     <w:tbl>
@@ -2845,7 +2853,7 @@
                 <w:sz w:val="19"/>
                 <w:szCs w:val="19"/>
               </w:rPr>
-              <w:t xml:space="preserve">El informe v5 de cada fase, su plan original y las tablas de respaldo</w:t>
+              <w:t xml:space="preserve">El informe de cada fase (v5; la Fase 1, v6), su plan original y las tablas de respaldo</w:t>
             </w:r>
           </w:p>
         </w:tc>
@@ -3478,7 +3486,7 @@
         <w:spacing w:after="80" w:line="264"/>
       </w:pPr>
       <w:r>
-        <w:t xml:space="preserve">Fase 1 v5: el diseño, las reglas y cómo quedaron las decisiones (sección 8 con los cambios y sus fechas).</w:t>
+        <w:t xml:space="preserve">Fase 1 v6: el diseño, las reglas y cómo quedaron las decisiones. Restaura la versión 2 del informe y la corrige según lo ejecutado (decisiones en la sección 17; cada corrección en el Anexo A).</w:t>
       </w:r>
     </w:p>
     <w:p>
@@ -4748,6 +4756,8 @@
             </w:pPr>
             <w:r>
               <w:rPr>
+                <w:b/>
+                <w:bCs/>
                 <w:sz w:val="19"/>
                 <w:szCs w:val="19"/>
               </w:rPr>
@@ -5245,6 +5255,8 @@
             </w:pPr>
             <w:r>
               <w:rPr>
+                <w:b/>
+                <w:bCs/>
                 <w:sz w:val="19"/>
                 <w:szCs w:val="19"/>
               </w:rPr>

</xml_diff>